<commit_message>
Complete lab metadata and dates for week1 and week2
</commit_message>
<xml_diff>
--- a/week1/陈欣语_2025302013043_实验1和2报告.docx
+++ b/week1/陈欣语_2025302013043_实验1和2报告.docx
@@ -280,7 +280,7 @@
                 <w:b w:val="0"/>
                 <w:sz w:val="22"/>
               </w:rPr>
-              <w:t>实验日期：</w:t>
+              <w:t>实验日期：2026年10月23日</w:t>
             </w:r>
           </w:p>
         </w:tc>
@@ -300,7 +300,7 @@
                 <w:b w:val="0"/>
                 <w:sz w:val="22"/>
               </w:rPr>
-              <w:t>实验地点：</w:t>
+              <w:t>实验地点：A237</w:t>
             </w:r>
           </w:p>
         </w:tc>
@@ -370,7 +370,7 @@
                 <w:b w:val="0"/>
                 <w:sz w:val="22"/>
               </w:rPr>
-              <w:t>学    院：</w:t>
+              <w:t>学    院：人工智能学院</w:t>
             </w:r>
           </w:p>
         </w:tc>
@@ -390,7 +390,7 @@
                 <w:b w:val="0"/>
                 <w:sz w:val="22"/>
               </w:rPr>
-              <w:t>专    业：</w:t>
+              <w:t>专    业：人工智能</w:t>
             </w:r>
           </w:p>
         </w:tc>

</xml_diff>